<commit_message>
Add in-text references for new Figures 7-10 and cite [21]
Stage 3 (docs/add_figure_refs.py), targeted, Figures 1-6 untouched:
- Add explicit RED in-text references for Figures 7, 8, 9, 10 in the paragraph
  immediately preceding each (no vague "following figure" phrasing).
- Cite reference [21] (De Vries, Patterns) 3x in the De Vries/Merge discussion
  (Introduction, Background, Results); corrected those red citations from [8]
  (Gervais) to [21]. Original black [8] citations unchanged.
- Audit: original Figures 1-6 images byte-identical (6/6); all references
  [1]-[21] cited; all figure numbers in captions appear in text; numbering 1-10
  sequential, no duplicates; all added text RED. PDF regenerated.

Co-Authored-By: Claude Opus 4.8 <noreply@anthropic.com>
Claude-Session: https://claude.ai/code/session_01G8UGacRqemk357h6YLLzRs
</commit_message>
<xml_diff>
--- a/docs/Extending_BlockSim_Energy_Carbon_REVISED_redline.docx
+++ b/docs/Extending_BlockSim_Energy_Carbon_REVISED_redline.docx
@@ -704,7 +704,7 @@
           <w:color w:val="C00000"/>
           <w:sz w:val="22"/>
         </w:rPr>
-        <w:t>It is important to clarify the energy characteristics of the consensus mechanisms considered. Proof-of-Work (PoW) energy consumption is economically driven: a rational miner invests in electricity up to the fiat value of the expected block reward, so total PoW energy depends primarily on the cryptocurrency price, the block subsidy, transaction fees, the electricity price, mining hardware efficiency, and the difficulty/hashrate equilibrium, rather than on the raw number of miners [16], [4]. Proof-of-Stake (PoS), by contrast, secures the network through stake and its energy is dominated by the number of validators kept online and their hardware power, essentially independent of coin price [19]. Notably, Ethereum transitioned from PoW to PoS at The Merge (September 2022), reducing its consensus energy by roughly 99.95% [8]; accordingly, current Ethereum is not a PoW system, and any PoW Ethereum configuration in this paper is labelled as a historical Ethereum-like PoW configuration only.</w:t>
+        <w:t>It is important to clarify the energy characteristics of the consensus mechanisms considered. Proof-of-Work (PoW) energy consumption is economically driven: a rational miner invests in electricity up to the fiat value of the expected block reward, so total PoW energy depends primarily on the cryptocurrency price, the block subsidy, transaction fees, the electricity price, mining hardware efficiency, and the difficulty/hashrate equilibrium, rather than on the raw number of miners [16], [4]. Proof-of-Stake (PoS), by contrast, secures the network through stake and its energy is dominated by the number of validators kept online and their hardware power, essentially independent of coin price [19]. Notably, Ethereum transitioned from PoW to PoS at The Merge (September 2022), reducing its consensus energy by roughly 99.95% [21]; accordingly, current Ethereum is not a PoW system, and any PoW Ethereum configuration in this paper is labelled as a historical Ethereum-like PoW configuration only.</w:t>
       </w:r>
     </w:p>
     <w:p>
@@ -852,7 +852,7 @@
           <w:color w:val="C00000"/>
           <w:sz w:val="22"/>
         </w:rPr>
-        <w:t>The energy gap between PoW and PoS is tied to how each mechanism resists Sybil attacks in a permissionless setting. PoW achieves Sybil resistance by binding influence to an external, costly resource (computation and therefore electricity), so PoW is not “free”: its permissionlessness is purchased through continuous resource expenditure, which is precisely why its energy use is large and coupled to coin price [16], [4]. PoS instead binds influence to internal economic stake and validator participation, removing most computational waste but introducing different trust and economic assumptions [19]. Platt, Platt and McBurney formalise these tensions as a Sybil-attack vulnerability trilemma among permissionlessness, Sybil resistance, and freeness [20], and De Vries documents how Ethereum’s move to PoS illustrates a sustainability path for the wider ecosystem [8]. These distinctions motivate treating PoW and PoS as two separate energy models in the remainder of the paper.</w:t>
+        <w:t>The energy gap between PoW and PoS is tied to how each mechanism resists Sybil attacks in a permissionless setting. PoW achieves Sybil resistance by binding influence to an external, costly resource (computation and therefore electricity), so PoW is not “free”: its permissionlessness is purchased through continuous resource expenditure, which is precisely why its energy use is large and coupled to coin price [16], [4]. PoS instead binds influence to internal economic stake and validator participation, removing most computational waste but introducing different trust and economic assumptions [19]. Platt, Platt and McBurney formalise these tensions as a Sybil-attack vulnerability trilemma among permissionlessness, Sybil resistance, and freeness [20], and De Vries documents how Ethereum’s move to PoS illustrates a sustainability path for the wider ecosystem [21]. These distinctions motivate treating PoW and PoS as two separate energy models in the remainder of the paper.</w:t>
       </w:r>
     </w:p>
     <w:p>
@@ -5962,6 +5962,14 @@
         </w:rPr>
         <w:t>These absolute magnitudes are scenario-based model outputs, not real-world measurements, and the Ethereum-labelled curve is a historical Ethereum-like PoW configuration that does not represent current (Proof-of-Stake) Ethereum. Under the added economic PoW model, total network energy is governed by mining economics rather than miner count: holding the economics fixed, the network total is approximately 467.5 GWh over 24 h and is essentially invariant across 50-1000 miners (95% CI ± 17.1 GWh), while mean per-miner energy falls approximately as 1/N. Energy scales linearly with coin price, rising from 155.8 GWh at 20,000 USD to 779.1 GWh at 100,000 USD, and inversely with electricity price, confirming the economic argument of Section D.</w:t>
       </w:r>
+      <w:r>
+        <w:rPr>
+          <w:rFonts w:ascii="Times New Roman" w:hAnsi="Times New Roman"/>
+          <w:color w:val="C00000"/>
+          <w:sz w:val="22"/>
+        </w:rPr>
+        <w:t xml:space="preserve"> Figure 7 summarizes the sensitivity of PoW network energy to the number of miners under the revised economic model: the network total is essentially invariant to miner count, while the mean per-miner energy falls approximately as 1/N.</w:t>
+      </w:r>
     </w:p>
     <w:p>
       <w:pPr>
@@ -6025,7 +6033,7 @@
           <w:color w:val="C00000"/>
           <w:sz w:val="22"/>
         </w:rPr>
-        <w:t xml:space="preserve">For Proof-of-Stake, the validator-count model yields far smaller totals: a 1000-validator network of standard 100 W servers consumes about 2387 kWh over 24 h, scaling linearly with validator count (239 kWh at 100 validators). The PoW/PoS energy ratio is on the order of 196,846×, consistent with the order-of-magnitude reductions reported in the literature [16], [19] and the ~99.95% reduction at Ethereum’s Merge [8]. As an analytical sanity check, fixed-power configurations reproduce the closed-form </w:t>
+        <w:t xml:space="preserve">For Proof-of-Stake, the validator-count model yields far smaller totals: a 1000-validator network of standard 100 W servers consumes about 2387 kWh over 24 h, scaling linearly with validator count (239 kWh at 100 validators). The PoW/PoS energy ratio is on the order of 196,846×, consistent with the order-of-magnitude reductions reported in the literature [16], [19] and the ~99.95% reduction at Ethereum’s Merge [21]. As an analytical sanity check, fixed-power configurations reproduce the closed-form </w:t>
       </w:r>
       <m:oMath>
         <m:r>
@@ -6082,6 +6090,14 @@
         </w:rPr>
         <w:t xml:space="preserve"> exactly (maximum relative error 0.00e+00).</w:t>
       </w:r>
+      <w:r>
+        <w:rPr>
+          <w:rFonts w:ascii="Times New Roman" w:hAnsi="Times New Roman"/>
+          <w:color w:val="C00000"/>
+          <w:sz w:val="22"/>
+        </w:rPr>
+        <w:t xml:space="preserve"> As shown in Figure 8, PoS total energy scales linearly with the number of validators across the low-power, standard-server, and high-power hardware classes.</w:t>
+      </w:r>
     </w:p>
     <w:p>
       <w:pPr>
@@ -6146,6 +6162,14 @@
           <w:sz w:val="22"/>
         </w:rPr>
         <w:t>Communication energy was also analysed. At peer degree 8 with 1 MB blocks it grows from 15.0 kWh/day at 1 tx/s to 1455 kWh/day at 100 tx/s. Relative to PoW consensus energy this is negligible (ratio ~3e-06), but at high throughput it becomes comparable to PoS consensus energy, so communication energy matters mainly in PoS and high-throughput settings.</w:t>
+      </w:r>
+      <w:r>
+        <w:rPr>
+          <w:rFonts w:ascii="Times New Roman" w:hAnsi="Times New Roman"/>
+          <w:color w:val="C00000"/>
+          <w:sz w:val="22"/>
+        </w:rPr>
+        <w:t xml:space="preserve"> Figure 9 compares computational (consensus) energy with communication energy under the evaluated scenarios on logarithmic axes.</w:t>
       </w:r>
     </w:p>
     <w:p>
@@ -6596,6 +6620,14 @@
           <w:sz w:val="22"/>
         </w:rPr>
         <w:t>Varying the grid emission factor shows that geography dominates carbon outcomes for a given energy level. For the PoW reference, daily emissions range from 23,374 t at γ = 0.05 to 383,332 t at γ = 0.82 (about a 16× spread from grid choice alone), while the PoS reference spans only 119-1947 kg. A single fixed emission factor is therefore insufficient.</w:t>
+      </w:r>
+      <w:r>
+        <w:rPr>
+          <w:rFonts w:ascii="Times New Roman" w:hAnsi="Times New Roman"/>
+          <w:color w:val="C00000"/>
+          <w:sz w:val="22"/>
+        </w:rPr>
+        <w:t xml:space="preserve"> Figure 10 reports the carbon-emission sensitivity under low, average, and high electricity emission factors γ.</w:t>
       </w:r>
     </w:p>
     <w:p>

</xml_diff>

<commit_message>
Formatting-only pass: figure placement markers, 10pt justified, restore Figs 5-6
Stage 4 (docs/format_revision_pass.py), formatting only — no content change:
- Replace embedded new figures (image7-10) with RED 10pt centered placement
  markers "[Insert Figure N here: ...]"; captions kept (RED, 10pt).
- Export new figures as separate files in figures_revision/ (PNG+PDF, renamed).
- Newly added/revised RED text set to 10pt and justified; new subsection
  headings now inherit the original Heading-2 style (10pt).
- Fix: spanned phrase-replacement in conservative_revision.py now preserves
  image runs, restoring original Figures 5-6 that had been dropped. All six
  original figures are byte-identical to the source again.
- Equations (11 displayed OMML) and all citations/figure refs preserved.

Co-Authored-By: Claude Opus 4.8 <noreply@anthropic.com>
Claude-Session: https://claude.ai/code/session_01G8UGacRqemk357h6YLLzRs
</commit_message>
<xml_diff>
--- a/docs/Extending_BlockSim_Energy_Carbon_REVISED_redline.docx
+++ b/docs/Extending_BlockSim_Energy_Carbon_REVISED_redline.docx
@@ -505,6 +505,7 @@
       <w:r>
         <w:rPr>
           <w:color w:val="C00000"/>
+          <w:sz w:val="20"/>
         </w:rPr>
         <w:t xml:space="preserve">Proof-of-Work reference configurations (Bitcoin, and a historical Ethereum-like PoW configuration that does not represent current Ethereum, which has used Proof-of-Stake since The Merge)</w:t>
       </w:r>
@@ -513,13 +514,16 @@
       </w:r>
     </w:p>
     <w:p>
+      <w:pPr>
+        <w:jc w:val="both"/>
+      </w:pPr>
       <w:r>
         <w:rPr>
           <w:rFonts w:ascii="Times New Roman" w:hAnsi="Times New Roman"/>
           <w:b w:val="0"/>
           <w:i w:val="0"/>
           <w:color w:val="C00000"/>
-          <w:sz w:val="22"/>
+          <w:sz w:val="20"/>
         </w:rPr>
         <w:t>In this revised version, the framework additionally distinguishes economically driven Proof-of-Work (PoW) energy consumption, in which the expected mining reward and cryptocurrency price are explicit inputs, from validator-count-driven Proof-of-Stake (PoS) energy consumption; it varies the carbon emission factor across grid scenarios; and it is positioned as a scenario-based evaluation tool for preliminary what-if analysis rather than a precise real-world energy estimator.</w:t>
       </w:r>
@@ -578,7 +582,7 @@
         <w:rPr>
           <w:rFonts w:ascii="Times New Roman" w:hAnsi="Times New Roman"/>
           <w:color w:val="C00000"/>
-          <w:sz w:val="22"/>
+          <w:sz w:val="20"/>
         </w:rPr>
         <w:t xml:space="preserve"> Proof of Stake, Carbon Footprint, Energy Modeling, Sustainability.</w:t>
       </w:r>
@@ -696,13 +700,16 @@
       </w:r>
     </w:p>
     <w:p>
+      <w:pPr>
+        <w:jc w:val="both"/>
+      </w:pPr>
       <w:r>
         <w:rPr>
           <w:rFonts w:ascii="Times New Roman" w:hAnsi="Times New Roman"/>
           <w:b w:val="0"/>
           <w:i w:val="0"/>
           <w:color w:val="C00000"/>
-          <w:sz w:val="22"/>
+          <w:sz w:val="20"/>
         </w:rPr>
         <w:t>It is important to clarify the energy characteristics of the consensus mechanisms considered. Proof-of-Work (PoW) energy consumption is economically driven: a rational miner invests in electricity up to the fiat value of the expected block reward, so total PoW energy depends primarily on the cryptocurrency price, the block subsidy, transaction fees, the electricity price, mining hardware efficiency, and the difficulty/hashrate equilibrium, rather than on the raw number of miners [16], [4]. Proof-of-Stake (PoS), by contrast, secures the network through stake and its energy is dominated by the number of validators kept online and their hardware power, essentially independent of coin price [19]. Notably, Ethereum transitioned from PoW to PoS at The Merge (September 2022), reducing its consensus energy by roughly 99.95% [21]; accordingly, current Ethereum is not a PoW system, and any PoW Ethereum configuration in this paper is labelled as a historical Ethereum-like PoW configuration only.</w:t>
       </w:r>
@@ -838,19 +845,21 @@
           <w:b w:val="0"/>
           <w:i w:val="0"/>
           <w:color w:val="C00000"/>
-          <w:sz w:val="22"/>
         </w:rPr>
         <w:t>Energy, Permissionlessness, and Sybil Resistance</w:t>
       </w:r>
     </w:p>
     <w:p>
+      <w:pPr>
+        <w:jc w:val="both"/>
+      </w:pPr>
       <w:r>
         <w:rPr>
           <w:rFonts w:ascii="Times New Roman" w:hAnsi="Times New Roman"/>
           <w:b w:val="0"/>
           <w:i w:val="0"/>
           <w:color w:val="C00000"/>
-          <w:sz w:val="22"/>
+          <w:sz w:val="20"/>
         </w:rPr>
         <w:t>The energy gap between PoW and PoS is tied to how each mechanism resists Sybil attacks in a permissionless setting. PoW achieves Sybil resistance by binding influence to an external, costly resource (computation and therefore electricity), so PoW is not “free”: its permissionlessness is purchased through continuous resource expenditure, which is precisely why its energy use is large and coupled to coin price [16], [4]. PoS instead binds influence to internal economic stake and validator participation, removing most computational waste but introducing different trust and economic assumptions [19]. Platt, Platt and McBurney formalise these tensions as a Sybil-attack vulnerability trilemma among permissionlessness, Sybil resistance, and freeness [20], and De Vries documents how Ethereum’s move to PoS illustrates a sustainability path for the wider ecosystem [21]. These distinctions motivate treating PoW and PoS as two separate energy models in the remainder of the paper.</w:t>
       </w:r>
@@ -2125,13 +2134,16 @@
       </w:r>
     </w:p>
     <w:p>
+      <w:pPr>
+        <w:jc w:val="both"/>
+      </w:pPr>
       <w:r>
         <w:rPr>
           <w:rFonts w:ascii="Times New Roman" w:hAnsi="Times New Roman"/>
           <w:b w:val="0"/>
           <w:i w:val="0"/>
           <w:color w:val="C00000"/>
-          <w:sz w:val="22"/>
+          <w:sz w:val="20"/>
         </w:rPr>
         <w:t>Although defined here, communication energy was not analysed in the previous version. In this revision it is instrumented with explicit transmit/receive counters for block and transaction messages and analysed in Section (Results) as a function of transaction rate, block size, and peer connectivity, and reported separately from consensus energy.</w:t>
       </w:r>
@@ -2434,17 +2446,19 @@
           <w:b w:val="0"/>
           <w:i w:val="0"/>
           <w:color w:val="C00000"/>
-          <w:sz w:val="22"/>
         </w:rPr>
         <w:t>D. Proof-of-Work Economic Energy Model</w:t>
       </w:r>
     </w:p>
     <w:p>
+      <w:pPr>
+        <w:jc w:val="both"/>
+      </w:pPr>
       <w:r>
         <w:rPr>
           <w:rFonts w:ascii="Times New Roman" w:hAnsi="Times New Roman"/>
           <w:color w:val="C00000"/>
-          <w:sz w:val="22"/>
+          <w:sz w:val="20"/>
         </w:rPr>
         <w:t xml:space="preserve">Because PoW energy is bounded by mining economics, we add an economic model. The expected per-block reward in fiat is given by Eq. (8), where </w:t>
       </w:r>
@@ -2478,7 +2492,7 @@
         <w:rPr>
           <w:rFonts w:ascii="Times New Roman" w:hAnsi="Times New Roman"/>
           <w:color w:val="C00000"/>
-          <w:sz w:val="22"/>
+          <w:sz w:val="20"/>
         </w:rPr>
         <w:t xml:space="preserve"> is the block subsidy, </w:t>
       </w:r>
@@ -2512,7 +2526,7 @@
         <w:rPr>
           <w:rFonts w:ascii="Times New Roman" w:hAnsi="Times New Roman"/>
           <w:color w:val="C00000"/>
-          <w:sz w:val="22"/>
+          <w:sz w:val="20"/>
         </w:rPr>
         <w:t xml:space="preserve"> the transaction fees, and </w:t>
       </w:r>
@@ -2546,7 +2560,7 @@
         <w:rPr>
           <w:rFonts w:ascii="Times New Roman" w:hAnsi="Times New Roman"/>
           <w:color w:val="C00000"/>
-          <w:sz w:val="22"/>
+          <w:sz w:val="20"/>
         </w:rPr>
         <w:t xml:space="preserve"> the coin price. A rational mining market spends a fraction </w:t>
       </w:r>
@@ -2565,7 +2579,7 @@
         <w:rPr>
           <w:rFonts w:ascii="Times New Roman" w:hAnsi="Times New Roman"/>
           <w:color w:val="C00000"/>
-          <w:sz w:val="22"/>
+          <w:sz w:val="20"/>
         </w:rPr>
         <w:t xml:space="preserve"> ∈ [0,1] of this reward on electricity, giving the economic energy budget per block in Eq. (9), where </w:t>
       </w:r>
@@ -2608,7 +2622,7 @@
         <w:rPr>
           <w:rFonts w:ascii="Times New Roman" w:hAnsi="Times New Roman"/>
           <w:color w:val="C00000"/>
-          <w:sz w:val="22"/>
+          <w:sz w:val="20"/>
         </w:rPr>
         <w:t xml:space="preserve"> is the electricity price per kWh. When hardware data are available, a technical bound </w:t>
       </w:r>
@@ -2708,7 +2722,7 @@
         <w:rPr>
           <w:rFonts w:ascii="Times New Roman" w:hAnsi="Times New Roman"/>
           <w:color w:val="C00000"/>
-          <w:sz w:val="22"/>
+          <w:sz w:val="20"/>
         </w:rPr>
         <w:t xml:space="preserve"> is derived from the expected hashes per block (</w:t>
       </w:r>
@@ -2793,7 +2807,7 @@
         <w:rPr>
           <w:rFonts w:ascii="Times New Roman" w:hAnsi="Times New Roman"/>
           <w:color w:val="C00000"/>
-          <w:sz w:val="22"/>
+          <w:sz w:val="20"/>
         </w:rPr>
         <w:t xml:space="preserve">) and the per-hash efficiency </w:t>
       </w:r>
@@ -2827,7 +2841,7 @@
         <w:rPr>
           <w:rFonts w:ascii="Times New Roman" w:hAnsi="Times New Roman"/>
           <w:color w:val="C00000"/>
-          <w:sz w:val="22"/>
+          <w:sz w:val="20"/>
         </w:rPr>
         <w:t xml:space="preserve">, and the network per-block energy is </w:t>
       </w:r>
@@ -2958,7 +2972,7 @@
         <w:rPr>
           <w:rFonts w:ascii="Times New Roman" w:hAnsi="Times New Roman"/>
           <w:color w:val="C00000"/>
-          <w:sz w:val="22"/>
+          <w:sz w:val="20"/>
         </w:rPr>
         <w:t xml:space="preserve">. The miner-level allocation by hashpower share </w:t>
       </w:r>
@@ -2992,7 +3006,7 @@
         <w:rPr>
           <w:rFonts w:ascii="Times New Roman" w:hAnsi="Times New Roman"/>
           <w:color w:val="C00000"/>
-          <w:sz w:val="22"/>
+          <w:sz w:val="20"/>
         </w:rPr>
         <w:t xml:space="preserve"> is given by Eq. (10). Thus PoW energy depends on coin price, reward, electricity price, efficiency, and difficulty/hashrate, and only the distribution depends on the number of miners.</w:t>
       </w:r>
@@ -3545,17 +3559,19 @@
           <w:b w:val="0"/>
           <w:i w:val="0"/>
           <w:color w:val="C00000"/>
-          <w:sz w:val="22"/>
         </w:rPr>
         <w:t>E. Proof-of-Stake Validator Energy Model</w:t>
       </w:r>
     </w:p>
     <w:p>
+      <w:pPr>
+        <w:jc w:val="both"/>
+      </w:pPr>
       <w:r>
         <w:rPr>
           <w:rFonts w:ascii="Times New Roman" w:hAnsi="Times New Roman"/>
           <w:color w:val="C00000"/>
-          <w:sz w:val="22"/>
+          <w:sz w:val="20"/>
         </w:rPr>
         <w:t xml:space="preserve">For PoS we add a validator-count model: the network energy is given by Eq. (11), where </w:t>
       </w:r>
@@ -3589,7 +3605,7 @@
         <w:rPr>
           <w:rFonts w:ascii="Times New Roman" w:hAnsi="Times New Roman"/>
           <w:color w:val="C00000"/>
-          <w:sz w:val="22"/>
+          <w:sz w:val="20"/>
         </w:rPr>
         <w:t xml:space="preserve"> is per-validator power (W), </w:t>
       </w:r>
@@ -3608,7 +3624,7 @@
         <w:rPr>
           <w:rFonts w:ascii="Times New Roman" w:hAnsi="Times New Roman"/>
           <w:color w:val="C00000"/>
-          <w:sz w:val="22"/>
+          <w:sz w:val="20"/>
         </w:rPr>
         <w:t xml:space="preserve"> the horizon (h), </w:t>
       </w:r>
@@ -3642,7 +3658,7 @@
         <w:rPr>
           <w:rFonts w:ascii="Times New Roman" w:hAnsi="Times New Roman"/>
           <w:color w:val="C00000"/>
-          <w:sz w:val="22"/>
+          <w:sz w:val="20"/>
         </w:rPr>
         <w:t xml:space="preserve"> ∈ [0,1] the uptime, </w:t>
       </w:r>
@@ -3661,7 +3677,7 @@
         <w:rPr>
           <w:rFonts w:ascii="Times New Roman" w:hAnsi="Times New Roman"/>
           <w:color w:val="C00000"/>
-          <w:sz w:val="22"/>
+          <w:sz w:val="20"/>
         </w:rPr>
         <w:t xml:space="preserve"> the number of validators, and </w:t>
       </w:r>
@@ -3695,7 +3711,7 @@
         <w:rPr>
           <w:rFonts w:ascii="Times New Roman" w:hAnsi="Times New Roman"/>
           <w:color w:val="C00000"/>
-          <w:sz w:val="22"/>
+          <w:sz w:val="20"/>
         </w:rPr>
         <w:t xml:space="preserve"> the communication energy. PoS energy therefore scales with validator count and hardware power and is independent of coin price.</w:t>
       </w:r>
@@ -4287,13 +4303,16 @@
       </w:r>
     </w:p>
     <w:p>
+      <w:pPr>
+        <w:jc w:val="both"/>
+      </w:pPr>
       <w:r>
         <w:rPr>
           <w:rFonts w:ascii="Times New Roman" w:hAnsi="Times New Roman"/>
           <w:b w:val="0"/>
           <w:i w:val="0"/>
           <w:color w:val="C00000"/>
-          <w:sz w:val="22"/>
+          <w:sz w:val="20"/>
         </w:rPr>
         <w:t>Because γ captures the carbon intensity of the underlying grid, the same energy yields very different emissions across regions and times. We therefore treat γ as an experimental variable with three scenarios: a low-carbon grid (γ = 0.05 kgCO₂e/kWh), a global-average grid (γ = 0.475), and a high-carbon grid (γ = 0.82); the sensitivity is reported in the Results.</w:t>
       </w:r>
@@ -5249,6 +5268,7 @@
       <w:r>
         <w:rPr>
           <w:color w:val="C00000"/>
+          <w:sz w:val="20"/>
         </w:rPr>
         <w:t xml:space="preserve">Bitcoin (Model 1) and a historical Ethereum-like PoW configuration (Model 2). The latter reflects the pre-Merge GPU-mining regime and does not represent current Ethereum, which has used Proof-of-Stake since The Merge</w:t>
       </w:r>
@@ -5305,6 +5325,7 @@
       <w:r>
         <w:rPr>
           <w:color w:val="C00000"/>
+          <w:sz w:val="20"/>
         </w:rPr>
         <w:t xml:space="preserve">configurable electricity emission factor; in this revision it is varied across low, average, and high grid scenarios (see Results) rather than held fixed</w:t>
       </w:r>
@@ -5344,9 +5365,9 @@
         <w:rPr>
           <w:rFonts w:ascii="Times New Roman" w:hAnsi="Times New Roman"/>
           <w:color w:val="C00000"/>
-          <w:sz w:val="22"/>
+          <w:sz w:val="20"/>
         </w:rPr>
-        <w:t>Each scenario is replicated across 30 independent random seeds (generated deterministically as base + i, i = 0..29), and results are reported as the mean with sample standard deviation and 95% confidence interval (Student t).</w:t>
+        <w:t xml:space="preserve">Each scenario is replicated across 30 independent random seeds (generated deterministically as base + i, i = 0..29), and results are reported as the mean with sample standard deviation and 95% confidence interval (Student t).</w:t>
       </w:r>
     </w:p>
     <w:p>
@@ -5952,13 +5973,16 @@
       </w:r>
     </w:p>
     <w:p>
+      <w:pPr>
+        <w:jc w:val="both"/>
+      </w:pPr>
       <w:r>
         <w:rPr>
           <w:rFonts w:ascii="Times New Roman" w:hAnsi="Times New Roman"/>
           <w:b w:val="0"/>
           <w:i w:val="0"/>
           <w:color w:val="C00000"/>
-          <w:sz w:val="22"/>
+          <w:sz w:val="20"/>
         </w:rPr>
         <w:t>These absolute magnitudes are scenario-based model outputs, not real-world measurements, and the Ethereum-labelled curve is a historical Ethereum-like PoW configuration that does not represent current (Proof-of-Stake) Ethereum. Under the added economic PoW model, total network energy is governed by mining economics rather than miner count: holding the economics fixed, the network total is approximately 467.5 GWh over 24 h and is essentially invariant across 50-1000 miners (95% CI ± 17.1 GWh), while mean per-miner energy falls approximately as 1/N. Energy scales linearly with coin price, rising from 155.8 GWh at 20,000 USD to 779.1 GWh at 100,000 USD, and inversely with electricity price, confirming the economic argument of Section D.</w:t>
       </w:r>
@@ -5966,7 +5990,7 @@
         <w:rPr>
           <w:rFonts w:ascii="Times New Roman" w:hAnsi="Times New Roman"/>
           <w:color w:val="C00000"/>
-          <w:sz w:val="22"/>
+          <w:sz w:val="20"/>
         </w:rPr>
         <w:t xml:space="preserve"> Figure 7 summarizes the sensitivity of PoW network energy to the number of miners under the revised economic model: the network total is essentially invariant to miner count, while the mean per-miner energy falls approximately as 1/N.</w:t>
       </w:r>
@@ -5976,38 +6000,12 @@
         <w:jc w:val="center"/>
       </w:pPr>
       <w:r>
-        <w:drawing>
-          <wp:inline xmlns:a="http://schemas.openxmlformats.org/drawingml/2006/main" xmlns:pic="http://schemas.openxmlformats.org/drawingml/2006/picture">
-            <wp:extent cx="5212080" cy="2048265"/>
-            <wp:docPr id="2043341619" name="Picture 2043341619"/>
-            <wp:cNvGraphicFramePr>
-              <a:graphicFrameLocks noChangeAspect="1"/>
-            </wp:cNvGraphicFramePr>
-            <a:graphic>
-              <a:graphicData uri="http://schemas.openxmlformats.org/drawingml/2006/picture">
-                <pic:pic>
-                  <pic:nvPicPr>
-                    <pic:cNvPr id="0" name="fig_pow_energy_vs_miners.png"/>
-                    <pic:cNvPicPr/>
-                  </pic:nvPicPr>
-                  <pic:blipFill>
-                    <a:blip r:embed="rId32"/>
-                    <a:stretch>
-                      <a:fillRect/>
-                    </a:stretch>
-                  </pic:blipFill>
-                  <pic:spPr>
-                    <a:xfrm>
-                      <a:off x="0" y="0"/>
-                      <a:ext cx="5212080" cy="2048265"/>
-                    </a:xfrm>
-                    <a:prstGeom prst="rect"/>
-                  </pic:spPr>
-                </pic:pic>
-              </a:graphicData>
-            </a:graphic>
-          </wp:inline>
-        </w:drawing>
+        <w:rPr>
+          <w:rFonts w:ascii="Times New Roman" w:hAnsi="Times New Roman"/>
+          <w:color w:val="C00000"/>
+          <w:sz w:val="20"/>
+        </w:rPr>
+        <w:t>[Insert Figure 7 here: PoW energy sensitivity to miner count]</w:t>
       </w:r>
     </w:p>
     <w:p>
@@ -6019,19 +6017,22 @@
           <w:rFonts w:ascii="Times New Roman" w:hAnsi="Times New Roman"/>
           <w:i/>
           <w:color w:val="C00000"/>
-          <w:sz w:val="19"/>
+          <w:sz w:val="20"/>
         </w:rPr>
         <w:t>Figure 7. PoW energy vs number of miners (economic model; 30 seeds, 95% CI). Total network energy is invariant to miner count (a); per-miner energy falls ~1/N (b).</w:t>
       </w:r>
     </w:p>
     <w:p>
+      <w:pPr>
+        <w:jc w:val="both"/>
+      </w:pPr>
       <w:r>
         <w:rPr>
           <w:rFonts w:ascii="Times New Roman" w:hAnsi="Times New Roman"/>
           <w:b w:val="0"/>
           <w:i w:val="0"/>
           <w:color w:val="C00000"/>
-          <w:sz w:val="22"/>
+          <w:sz w:val="20"/>
         </w:rPr>
         <w:t xml:space="preserve">For Proof-of-Stake, the validator-count model yields far smaller totals: a 1000-validator network of standard 100 W servers consumes about 2387 kWh over 24 h, scaling linearly with validator count (239 kWh at 100 validators). The PoW/PoS energy ratio is on the order of 196,846×, consistent with the order-of-magnitude reductions reported in the literature [16], [19] and the ~99.95% reduction at Ethereum’s Merge [21]. As an analytical sanity check, fixed-power configurations reproduce the closed-form </w:t>
       </w:r>
@@ -6086,7 +6087,7 @@
         <w:rPr>
           <w:rFonts w:ascii="Times New Roman" w:hAnsi="Times New Roman"/>
           <w:color w:val="C00000"/>
-          <w:sz w:val="22"/>
+          <w:sz w:val="20"/>
         </w:rPr>
         <w:t xml:space="preserve"> exactly (maximum relative error 0.00e+00).</w:t>
       </w:r>
@@ -6094,7 +6095,7 @@
         <w:rPr>
           <w:rFonts w:ascii="Times New Roman" w:hAnsi="Times New Roman"/>
           <w:color w:val="C00000"/>
-          <w:sz w:val="22"/>
+          <w:sz w:val="20"/>
         </w:rPr>
         <w:t xml:space="preserve"> As shown in Figure 8, PoS total energy scales linearly with the number of validators across the low-power, standard-server, and high-power hardware classes.</w:t>
       </w:r>
@@ -6104,38 +6105,12 @@
         <w:jc w:val="center"/>
       </w:pPr>
       <w:r>
-        <w:drawing>
-          <wp:inline xmlns:a="http://schemas.openxmlformats.org/drawingml/2006/main" xmlns:pic="http://schemas.openxmlformats.org/drawingml/2006/picture">
-            <wp:extent cx="5212080" cy="3166523"/>
-            <wp:docPr id="2043341620" name="Picture 2043341620"/>
-            <wp:cNvGraphicFramePr>
-              <a:graphicFrameLocks noChangeAspect="1"/>
-            </wp:cNvGraphicFramePr>
-            <a:graphic>
-              <a:graphicData uri="http://schemas.openxmlformats.org/drawingml/2006/picture">
-                <pic:pic>
-                  <pic:nvPicPr>
-                    <pic:cNvPr id="0" name="fig_pos_energy_vs_validators.png"/>
-                    <pic:cNvPicPr/>
-                  </pic:nvPicPr>
-                  <pic:blipFill>
-                    <a:blip r:embed="rId33"/>
-                    <a:stretch>
-                      <a:fillRect/>
-                    </a:stretch>
-                  </pic:blipFill>
-                  <pic:spPr>
-                    <a:xfrm>
-                      <a:off x="0" y="0"/>
-                      <a:ext cx="5212080" cy="3166523"/>
-                    </a:xfrm>
-                    <a:prstGeom prst="rect"/>
-                  </pic:spPr>
-                </pic:pic>
-              </a:graphicData>
-            </a:graphic>
-          </wp:inline>
-        </w:drawing>
+        <w:rPr>
+          <w:rFonts w:ascii="Times New Roman" w:hAnsi="Times New Roman"/>
+          <w:color w:val="C00000"/>
+          <w:sz w:val="20"/>
+        </w:rPr>
+        <w:t>[Insert Figure 8 here: PoS energy scaling with validator count]</w:t>
       </w:r>
     </w:p>
     <w:p>
@@ -6147,19 +6122,22 @@
           <w:rFonts w:ascii="Times New Roman" w:hAnsi="Times New Roman"/>
           <w:i/>
           <w:color w:val="C00000"/>
-          <w:sz w:val="19"/>
+          <w:sz w:val="20"/>
         </w:rPr>
         <w:t>Figure 8. PoS total energy vs validator count for three hardware classes (30 seeds, 95% CI).</w:t>
       </w:r>
     </w:p>
     <w:p>
+      <w:pPr>
+        <w:jc w:val="both"/>
+      </w:pPr>
       <w:r>
         <w:rPr>
           <w:rFonts w:ascii="Times New Roman" w:hAnsi="Times New Roman"/>
           <w:b w:val="0"/>
           <w:i w:val="0"/>
           <w:color w:val="C00000"/>
-          <w:sz w:val="22"/>
+          <w:sz w:val="20"/>
         </w:rPr>
         <w:t>Communication energy was also analysed. At peer degree 8 with 1 MB blocks it grows from 15.0 kWh/day at 1 tx/s to 1455 kWh/day at 100 tx/s. Relative to PoW consensus energy this is negligible (ratio ~3e-06), but at high throughput it becomes comparable to PoS consensus energy, so communication energy matters mainly in PoS and high-throughput settings.</w:t>
       </w:r>
@@ -6167,7 +6145,7 @@
         <w:rPr>
           <w:rFonts w:ascii="Times New Roman" w:hAnsi="Times New Roman"/>
           <w:color w:val="C00000"/>
-          <w:sz w:val="22"/>
+          <w:sz w:val="20"/>
         </w:rPr>
         <w:t xml:space="preserve"> Figure 9 compares computational (consensus) energy with communication energy under the evaluated scenarios on logarithmic axes.</w:t>
       </w:r>
@@ -6177,38 +6155,12 @@
         <w:jc w:val="center"/>
       </w:pPr>
       <w:r>
-        <w:drawing>
-          <wp:inline xmlns:a="http://schemas.openxmlformats.org/drawingml/2006/main" xmlns:pic="http://schemas.openxmlformats.org/drawingml/2006/picture">
-            <wp:extent cx="5212080" cy="2981633"/>
-            <wp:docPr id="2043341621" name="Picture 2043341621"/>
-            <wp:cNvGraphicFramePr>
-              <a:graphicFrameLocks noChangeAspect="1"/>
-            </wp:cNvGraphicFramePr>
-            <a:graphic>
-              <a:graphicData uri="http://schemas.openxmlformats.org/drawingml/2006/picture">
-                <pic:pic>
-                  <pic:nvPicPr>
-                    <pic:cNvPr id="0" name="fig_computation_vs_communication.png"/>
-                    <pic:cNvPicPr/>
-                  </pic:nvPicPr>
-                  <pic:blipFill>
-                    <a:blip r:embed="rId34"/>
-                    <a:stretch>
-                      <a:fillRect/>
-                    </a:stretch>
-                  </pic:blipFill>
-                  <pic:spPr>
-                    <a:xfrm>
-                      <a:off x="0" y="0"/>
-                      <a:ext cx="5212080" cy="2981633"/>
-                    </a:xfrm>
-                    <a:prstGeom prst="rect"/>
-                  </pic:spPr>
-                </pic:pic>
-              </a:graphicData>
-            </a:graphic>
-          </wp:inline>
-        </w:drawing>
+        <w:rPr>
+          <w:rFonts w:ascii="Times New Roman" w:hAnsi="Times New Roman"/>
+          <w:color w:val="C00000"/>
+          <w:sz w:val="20"/>
+        </w:rPr>
+        <w:t>[Insert Figure 9 here: Computational/consensus energy versus communication energy]</w:t>
       </w:r>
     </w:p>
     <w:p>
@@ -6220,7 +6172,7 @@
           <w:rFonts w:ascii="Times New Roman" w:hAnsi="Times New Roman"/>
           <w:i/>
           <w:color w:val="C00000"/>
-          <w:sz w:val="19"/>
+          <w:sz w:val="20"/>
         </w:rPr>
         <w:t>Figure 9. Computation vs communication energy (log-log; peer degree 8, 1 MB blocks, 30 seeds).</w:t>
       </w:r>
@@ -6524,133 +6476,53 @@
         <w:rPr>
           <w:rFonts w:ascii="Times New Roman" w:hAnsi="Times New Roman"/>
           <w:color w:val="C00000"/>
-          <w:sz w:val="22"/>
+          <w:sz w:val="20"/>
         </w:rPr>
-        <w:t>via an emission factor that, in this revision, is varied across low/average/high grid scenarios rather than held fixed [3]</w:t>
+        <w:t xml:space="preserve">via an emission factor that, in this revision, is varied across low/average/high grid scenarios rather than held fixed [3]</w:t>
       </w:r>
       <w:r>
         <w:rPr>
           <w:rFonts w:ascii="Times New Roman" w:hAnsi="Times New Roman"/>
           <w:sz w:val="22"/>
         </w:rPr>
-        <w:t>. In the evaluated configuration, cumulative CO₂ totals increased proportionally with miner count:</w:t>
-      </w:r>
-    </w:p>
-    <w:p>
-      <w:pPr>
-        <w:pStyle w:val="RSR"/>
-        <w:numPr>
-          <w:ilvl w:val="0"/>
-          <w:numId w:val="41"/>
-        </w:numPr>
-        <w:ind w:left="426" w:hanging="137"/>
-      </w:pPr>
-      <w:r>
-        <w:t xml:space="preserve">Bitcoin: 1.75 kg </w:t>
-      </w:r>
-      <w:proofErr w:type="spellStart"/>
-      <w:r>
-        <w:t>CO₂e</w:t>
-      </w:r>
-      <w:proofErr w:type="spellEnd"/>
-      <w:r>
-        <w:t xml:space="preserve"> (50 miners) → 37.31 kg </w:t>
-      </w:r>
-      <w:proofErr w:type="spellStart"/>
-      <w:r>
-        <w:t>CO₂e</w:t>
-      </w:r>
-      <w:proofErr w:type="spellEnd"/>
-      <w:r>
-        <w:t xml:space="preserve"> (1000 miners)</w:t>
-      </w:r>
-    </w:p>
-    <w:p>
-      <w:pPr>
-        <w:pStyle w:val="RSR"/>
-        <w:numPr>
-          <w:ilvl w:val="0"/>
-          <w:numId w:val="41"/>
-        </w:numPr>
-        <w:ind w:left="426" w:hanging="137"/>
-      </w:pPr>
-      <w:r>
-        <w:t xml:space="preserve">Ethereum: 154.28 kg </w:t>
-      </w:r>
-      <w:proofErr w:type="spellStart"/>
-      <w:r>
-        <w:t>CO₂e</w:t>
-      </w:r>
-      <w:proofErr w:type="spellEnd"/>
-      <w:r>
-        <w:t xml:space="preserve"> (50 miners) → 3085.69 kg </w:t>
-      </w:r>
-      <w:proofErr w:type="spellStart"/>
-      <w:r>
-        <w:t>CO₂e</w:t>
-      </w:r>
-      <w:proofErr w:type="spellEnd"/>
-      <w:r>
-        <w:t xml:space="preserve"> (1000 miners)</w:t>
-      </w:r>
-    </w:p>
-    <w:p>
-      <w:pPr>
-        <w:pStyle w:val="RSR"/>
-      </w:pPr>
-      <w:r>
-        <w:t xml:space="preserve">As expected, the carbon curves preserve the same ordering and near-linear scaling as energy because the model uses a constant grid factor. This follows standard emissions accounting (kWh × </w:t>
-      </w:r>
-      <w:proofErr w:type="spellStart"/>
-      <w:r>
-        <w:t>kgCO₂e</w:t>
-      </w:r>
-      <w:proofErr w:type="spellEnd"/>
-      <w:r>
-        <w:t>/kWh).</w:t>
-      </w:r>
-    </w:p>
-    <w:p>
+        <w:t xml:space="preserve">. In the evaluated configuration, cumulative CO₂ totals increased proportionally with miner count:</w:t>
+      </w:r>
       <w:r>
         <w:rPr>
-          <w:rFonts w:ascii="Times New Roman" w:hAnsi="Times New Roman"/>
-          <w:b w:val="0"/>
-          <w:i w:val="0"/>
-          <w:color w:val="C00000"/>
-          <w:sz w:val="22"/>
+          <w:noProof/>
         </w:rPr>
-        <w:t>Varying the grid emission factor shows that geography dominates carbon outcomes for a given energy level. For the PoW reference, daily emissions range from 23,374 t at γ = 0.05 to 383,332 t at γ = 0.82 (about a 16× spread from grid choice alone), while the PoS reference spans only 119-1947 kg. A single fixed emission factor is therefore insufficient.</w:t>
-      </w:r>
-      <w:r>
-        <w:rPr>
-          <w:rFonts w:ascii="Times New Roman" w:hAnsi="Times New Roman"/>
-          <w:color w:val="C00000"/>
-          <w:sz w:val="22"/>
-        </w:rPr>
-        <w:t xml:space="preserve"> Figure 10 reports the carbon-emission sensitivity under low, average, and high electricity emission factors γ.</w:t>
-      </w:r>
-    </w:p>
-    <w:p>
-      <w:pPr>
-        <w:jc w:val="center"/>
-      </w:pPr>
-      <w:r>
+        <w:lastRenderedPageBreak/>
         <w:drawing>
-          <wp:inline xmlns:a="http://schemas.openxmlformats.org/drawingml/2006/main" xmlns:pic="http://schemas.openxmlformats.org/drawingml/2006/picture">
-            <wp:extent cx="5212080" cy="2938201"/>
-            <wp:docPr id="2043341622" name="Picture 2043341622"/>
+          <wp:anchor distT="0" distB="0" distL="114300" distR="114300" simplePos="0" relativeHeight="251679744" behindDoc="0" locked="0" layoutInCell="1" allowOverlap="1" wp14:anchorId="11344399" wp14:editId="3A94BB84">
+            <wp:simplePos x="0" y="0"/>
+            <wp:positionH relativeFrom="column">
+              <wp:posOffset>3251200</wp:posOffset>
+            </wp:positionH>
+            <wp:positionV relativeFrom="paragraph">
+              <wp:posOffset>2540</wp:posOffset>
+            </wp:positionV>
+            <wp:extent cx="2929890" cy="1709420"/>
+            <wp:effectExtent l="0" t="0" r="3810" b="5080"/>
+            <wp:wrapTopAndBottom/>
+            <wp:docPr id="1097695332" name="Picture 1"/>
             <wp:cNvGraphicFramePr>
-              <a:graphicFrameLocks noChangeAspect="1"/>
+              <a:graphicFrameLocks xmlns:a="http://schemas.openxmlformats.org/drawingml/2006/main" noChangeAspect="1"/>
             </wp:cNvGraphicFramePr>
-            <a:graphic>
+            <a:graphic xmlns:a="http://schemas.openxmlformats.org/drawingml/2006/main">
               <a:graphicData uri="http://schemas.openxmlformats.org/drawingml/2006/picture">
-                <pic:pic>
+                <pic:pic xmlns:pic="http://schemas.openxmlformats.org/drawingml/2006/picture">
                   <pic:nvPicPr>
-                    <pic:cNvPr id="0" name="fig_carbon_vs_gamma.png"/>
+                    <pic:cNvPr id="1097695332" name="Picture 1"/>
                     <pic:cNvPicPr/>
                   </pic:nvPicPr>
                   <pic:blipFill>
-                    <a:blip r:embed="rId35"/>
+                    <a:blip r:embed="rId12" cstate="print">
+                      <a:extLst>
+                        <a:ext uri="{28A0092B-C50C-407E-A947-70E740481C1C}">
+                          <a14:useLocalDpi xmlns:a14="http://schemas.microsoft.com/office/drawing/2010/main" val="0"/>
+                        </a:ext>
+                      </a:extLst>
+                    </a:blip>
                     <a:stretch>
                       <a:fillRect/>
                     </a:stretch>
@@ -6658,15 +6530,525 @@
                   <pic:spPr>
                     <a:xfrm>
                       <a:off x="0" y="0"/>
-                      <a:ext cx="5212080" cy="2938201"/>
+                      <a:ext cx="2929890" cy="1709420"/>
                     </a:xfrm>
-                    <a:prstGeom prst="rect"/>
+                    <a:prstGeom prst="rect">
+                      <a:avLst/>
+                    </a:prstGeom>
                   </pic:spPr>
                 </pic:pic>
               </a:graphicData>
             </a:graphic>
-          </wp:inline>
+            <wp14:sizeRelH relativeFrom="margin">
+              <wp14:pctWidth>0</wp14:pctWidth>
+            </wp14:sizeRelH>
+            <wp14:sizeRelV relativeFrom="margin">
+              <wp14:pctHeight>0</wp14:pctHeight>
+            </wp14:sizeRelV>
+          </wp:anchor>
         </w:drawing>
+      </w:r>
+      <w:r>
+        <w:rPr>
+          <w:noProof/>
+        </w:rPr>
+        <mc:AlternateContent>
+          <mc:Choice Requires="wps">
+            <w:drawing>
+              <wp:anchor distT="0" distB="0" distL="114300" distR="114300" simplePos="0" relativeHeight="251681792" behindDoc="0" locked="0" layoutInCell="1" allowOverlap="1" wp14:anchorId="5B79F5B5" wp14:editId="60D1B8D1">
+                <wp:simplePos x="0" y="0"/>
+                <wp:positionH relativeFrom="column">
+                  <wp:posOffset>3249295</wp:posOffset>
+                </wp:positionH>
+                <wp:positionV relativeFrom="paragraph">
+                  <wp:posOffset>1730685</wp:posOffset>
+                </wp:positionV>
+                <wp:extent cx="2931160" cy="635"/>
+                <wp:effectExtent l="0" t="0" r="2540" b="0"/>
+                <wp:wrapTopAndBottom/>
+                <wp:docPr id="564958562" name="Text Box 1"/>
+                <wp:cNvGraphicFramePr/>
+                <a:graphic xmlns:a="http://schemas.openxmlformats.org/drawingml/2006/main">
+                  <a:graphicData uri="http://schemas.microsoft.com/office/word/2010/wordprocessingShape">
+                    <wps:wsp>
+                      <wps:cNvSpPr txBox="1"/>
+                      <wps:spPr>
+                        <a:xfrm>
+                          <a:off x="0" y="0"/>
+                          <a:ext cx="2931160" cy="635"/>
+                        </a:xfrm>
+                        <a:prstGeom prst="rect">
+                          <a:avLst/>
+                        </a:prstGeom>
+                        <a:solidFill>
+                          <a:prstClr val="white"/>
+                        </a:solidFill>
+                        <a:ln>
+                          <a:noFill/>
+                        </a:ln>
+                      </wps:spPr>
+                      <wps:txbx>
+                        <w:txbxContent>
+                          <w:p>
+                            <w:pPr>
+                              <w:pStyle w:val="Caption"/>
+                              <w:jc w:val="center"/>
+                              <w:rPr>
+                                <w:rFonts w:ascii="Times New Roman" w:eastAsia="SimSun" w:hAnsi="Times New Roman"/>
+                                <w:noProof/>
+                                <w:spacing w:val="-1"/>
+                              </w:rPr>
+                            </w:pPr>
+                            <w:r>
+                              <w:t xml:space="preserve">Figure </w:t>
+                            </w:r>
+                            <w:r>
+                              <w:fldChar w:fldCharType="begin"/>
+                            </w:r>
+                            <w:r>
+                              <w:instrText xml:space="preserve"> SEQ Figure \* ARABIC </w:instrText>
+                            </w:r>
+                            <w:r>
+                              <w:fldChar w:fldCharType="separate"/>
+                            </w:r>
+                            <w:r>
+                              <w:rPr>
+                                <w:noProof/>
+                              </w:rPr>
+                              <w:t>6</w:t>
+                            </w:r>
+                            <w:r>
+                              <w:fldChar w:fldCharType="end"/>
+                            </w:r>
+                            <w:r>
+                              <w:rPr>
+                                <w:lang w:val="en-US"/>
+                              </w:rPr>
+                              <w:t xml:space="preserve">:  </w:t>
+                            </w:r>
+                            <w:r>
+                              <w:rPr>
+                                <w:lang w:val="en-US"/>
+                              </w:rPr>
+                              <w:t>1000 Miners Pairwise CO₂ comparison</w:t>
+                            </w:r>
+                          </w:p>
+                        </w:txbxContent>
+                      </wps:txbx>
+                      <wps:bodyPr rot="0" spcFirstLastPara="0" vertOverflow="overflow" horzOverflow="overflow" vert="horz" wrap="square" lIns="0" tIns="0" rIns="0" bIns="0" numCol="1" spcCol="0" rtlCol="1" fromWordArt="0" anchor="t" anchorCtr="0" forceAA="0" compatLnSpc="1">
+                        <a:prstTxWarp prst="textNoShape">
+                          <a:avLst/>
+                        </a:prstTxWarp>
+                        <a:spAutoFit/>
+                      </wps:bodyPr>
+                    </wps:wsp>
+                  </a:graphicData>
+                </a:graphic>
+              </wp:anchor>
+            </w:drawing>
+          </mc:Choice>
+          <mc:Fallback>
+            <w:pict>
+              <v:shape w14:anchorId="5B79F5B5" id="_x0000_s1031" type="#_x0000_t202" style="position:absolute;left:0;text-align:left;margin-left:255.85pt;margin-top:136.25pt;width:230.8pt;height:.05pt;z-index:251681792;visibility:visible;mso-wrap-style:square;mso-wrap-distance-left:9pt;mso-wrap-distance-top:0;mso-wrap-distance-right:9pt;mso-wrap-distance-bottom:0;mso-position-horizontal:absolute;mso-position-horizontal-relative:text;mso-position-vertical:absolute;mso-position-vertical-relative:text;v-text-anchor:top" o:gfxdata="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" stroked="f">
+                <v:textbox style="mso-fit-shape-to-text:t" inset="0,0,0,0">
+                  <w:txbxContent>
+                    <w:p>
+                      <w:pPr>
+                        <w:pStyle w:val="Caption"/>
+                        <w:jc w:val="center"/>
+                        <w:rPr>
+                          <w:rFonts w:ascii="Times New Roman" w:eastAsia="SimSun" w:hAnsi="Times New Roman"/>
+                          <w:noProof/>
+                          <w:spacing w:val="-1"/>
+                        </w:rPr>
+                      </w:pPr>
+                      <w:r>
+                        <w:t xml:space="preserve">Figure </w:t>
+                      </w:r>
+                      <w:r>
+                        <w:fldChar w:fldCharType="begin"/>
+                      </w:r>
+                      <w:r>
+                        <w:instrText xml:space="preserve"> SEQ Figure \* ARABIC </w:instrText>
+                      </w:r>
+                      <w:r>
+                        <w:fldChar w:fldCharType="separate"/>
+                      </w:r>
+                      <w:r>
+                        <w:rPr>
+                          <w:noProof/>
+                        </w:rPr>
+                        <w:t>6</w:t>
+                      </w:r>
+                      <w:r>
+                        <w:fldChar w:fldCharType="end"/>
+                      </w:r>
+                      <w:r>
+                        <w:rPr>
+                          <w:lang w:val="en-US"/>
+                        </w:rPr>
+                        <w:t xml:space="preserve">:  </w:t>
+                      </w:r>
+                      <w:r>
+                        <w:rPr>
+                          <w:lang w:val="en-US"/>
+                        </w:rPr>
+                        <w:t>1000 Miners Pairwise CO₂ comparison</w:t>
+                      </w:r>
+                    </w:p>
+                  </w:txbxContent>
+                </v:textbox>
+                <w10:wrap type="topAndBottom"/>
+              </v:shape>
+            </w:pict>
+          </mc:Fallback>
+        </mc:AlternateContent>
+      </w:r>
+      <w:r>
+        <w:rPr>
+          <w:noProof/>
+        </w:rPr>
+        <mc:AlternateContent>
+          <mc:Choice Requires="wps">
+            <w:drawing>
+              <wp:anchor distT="0" distB="0" distL="114300" distR="114300" simplePos="0" relativeHeight="251677696" behindDoc="0" locked="0" layoutInCell="1" allowOverlap="1" wp14:anchorId="3E89B8B6" wp14:editId="510D2746">
+                <wp:simplePos x="0" y="0"/>
+                <wp:positionH relativeFrom="column">
+                  <wp:posOffset>-85725</wp:posOffset>
+                </wp:positionH>
+                <wp:positionV relativeFrom="paragraph">
+                  <wp:posOffset>1726831</wp:posOffset>
+                </wp:positionV>
+                <wp:extent cx="2931160" cy="635"/>
+                <wp:effectExtent l="0" t="0" r="2540" b="0"/>
+                <wp:wrapTopAndBottom/>
+                <wp:docPr id="819135611" name="Text Box 1"/>
+                <wp:cNvGraphicFramePr/>
+                <a:graphic xmlns:a="http://schemas.openxmlformats.org/drawingml/2006/main">
+                  <a:graphicData uri="http://schemas.microsoft.com/office/word/2010/wordprocessingShape">
+                    <wps:wsp>
+                      <wps:cNvSpPr txBox="1"/>
+                      <wps:spPr>
+                        <a:xfrm>
+                          <a:off x="0" y="0"/>
+                          <a:ext cx="2931160" cy="635"/>
+                        </a:xfrm>
+                        <a:prstGeom prst="rect">
+                          <a:avLst/>
+                        </a:prstGeom>
+                        <a:solidFill>
+                          <a:prstClr val="white"/>
+                        </a:solidFill>
+                        <a:ln>
+                          <a:noFill/>
+                        </a:ln>
+                      </wps:spPr>
+                      <wps:txbx>
+                        <w:txbxContent>
+                          <w:p>
+                            <w:pPr>
+                              <w:pStyle w:val="Caption"/>
+                              <w:jc w:val="center"/>
+                              <w:rPr>
+                                <w:rFonts w:ascii="Times New Roman" w:eastAsia="SimSun" w:hAnsi="Times New Roman"/>
+                                <w:smallCaps/>
+                                <w:noProof/>
+                              </w:rPr>
+                            </w:pPr>
+                            <w:r>
+                              <w:t xml:space="preserve">Figure </w:t>
+                            </w:r>
+                            <w:r>
+                              <w:fldChar w:fldCharType="begin"/>
+                            </w:r>
+                            <w:r>
+                              <w:instrText xml:space="preserve"> SEQ Figure \* ARABIC </w:instrText>
+                            </w:r>
+                            <w:r>
+                              <w:fldChar w:fldCharType="separate"/>
+                            </w:r>
+                            <w:r>
+                              <w:rPr>
+                                <w:noProof/>
+                              </w:rPr>
+                              <w:t>5</w:t>
+                            </w:r>
+                            <w:r>
+                              <w:fldChar w:fldCharType="end"/>
+                            </w:r>
+                            <w:r>
+                              <w:rPr>
+                                <w:noProof/>
+                                <w:lang w:val="en-US"/>
+                              </w:rPr>
+                              <w:t xml:space="preserve">: </w:t>
+                            </w:r>
+                            <w:r>
+                              <w:rPr>
+                                <w:noProof/>
+                                <w:lang w:val="en-US"/>
+                              </w:rPr>
+                              <w:t>Fig. 5.</w:t>
+                            </w:r>
+                            <w:r>
+                              <w:rPr>
+                                <w:noProof/>
+                                <w:lang w:val="en-US"/>
+                              </w:rPr>
+                              <w:tab/>
+                              <w:t>50 Miners Pairwise CO₂ comparison</w:t>
+                            </w:r>
+                          </w:p>
+                        </w:txbxContent>
+                      </wps:txbx>
+                      <wps:bodyPr rot="0" spcFirstLastPara="0" vertOverflow="overflow" horzOverflow="overflow" vert="horz" wrap="square" lIns="0" tIns="0" rIns="0" bIns="0" numCol="1" spcCol="0" rtlCol="1" fromWordArt="0" anchor="t" anchorCtr="0" forceAA="0" compatLnSpc="1">
+                        <a:prstTxWarp prst="textNoShape">
+                          <a:avLst/>
+                        </a:prstTxWarp>
+                        <a:spAutoFit/>
+                      </wps:bodyPr>
+                    </wps:wsp>
+                  </a:graphicData>
+                </a:graphic>
+              </wp:anchor>
+            </w:drawing>
+          </mc:Choice>
+          <mc:Fallback>
+            <w:pict>
+              <v:shape w14:anchorId="3E89B8B6" id="_x0000_s1032" type="#_x0000_t202" style="position:absolute;left:0;text-align:left;margin-left:-6.75pt;margin-top:135.95pt;width:230.8pt;height:.05pt;z-index:251677696;visibility:visible;mso-wrap-style:square;mso-wrap-distance-left:9pt;mso-wrap-distance-top:0;mso-wrap-distance-right:9pt;mso-wrap-distance-bottom:0;mso-position-horizontal:absolute;mso-position-horizontal-relative:text;mso-position-vertical:absolute;mso-position-vertical-relative:text;v-text-anchor:top" o:gfxdata="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" stroked="f">
+                <v:textbox style="mso-fit-shape-to-text:t" inset="0,0,0,0">
+                  <w:txbxContent>
+                    <w:p>
+                      <w:pPr>
+                        <w:pStyle w:val="Caption"/>
+                        <w:jc w:val="center"/>
+                        <w:rPr>
+                          <w:rFonts w:ascii="Times New Roman" w:eastAsia="SimSun" w:hAnsi="Times New Roman"/>
+                          <w:smallCaps/>
+                          <w:noProof/>
+                        </w:rPr>
+                      </w:pPr>
+                      <w:r>
+                        <w:t xml:space="preserve">Figure </w:t>
+                      </w:r>
+                      <w:r>
+                        <w:fldChar w:fldCharType="begin"/>
+                      </w:r>
+                      <w:r>
+                        <w:instrText xml:space="preserve"> SEQ Figure \* ARABIC </w:instrText>
+                      </w:r>
+                      <w:r>
+                        <w:fldChar w:fldCharType="separate"/>
+                      </w:r>
+                      <w:r>
+                        <w:rPr>
+                          <w:noProof/>
+                        </w:rPr>
+                        <w:t>5</w:t>
+                      </w:r>
+                      <w:r>
+                        <w:fldChar w:fldCharType="end"/>
+                      </w:r>
+                      <w:r>
+                        <w:rPr>
+                          <w:noProof/>
+                          <w:lang w:val="en-US"/>
+                        </w:rPr>
+                        <w:t xml:space="preserve">: </w:t>
+                      </w:r>
+                      <w:r>
+                        <w:rPr>
+                          <w:noProof/>
+                          <w:lang w:val="en-US"/>
+                        </w:rPr>
+                        <w:t>Fig. 5.</w:t>
+                      </w:r>
+                      <w:r>
+                        <w:rPr>
+                          <w:noProof/>
+                          <w:lang w:val="en-US"/>
+                        </w:rPr>
+                        <w:tab/>
+                        <w:t>50 Miners Pairwise CO₂ comparison</w:t>
+                      </w:r>
+                    </w:p>
+                  </w:txbxContent>
+                </v:textbox>
+                <w10:wrap type="topAndBottom"/>
+              </v:shape>
+            </w:pict>
+          </mc:Fallback>
+        </mc:AlternateContent>
+      </w:r>
+      <w:r>
+        <w:rPr>
+          <w:noProof/>
+        </w:rPr>
+        <w:drawing>
+          <wp:anchor distT="0" distB="0" distL="114300" distR="114300" simplePos="0" relativeHeight="251675648" behindDoc="0" locked="0" layoutInCell="1" allowOverlap="1" wp14:anchorId="0333D0E5" wp14:editId="70390E03">
+            <wp:simplePos x="0" y="0"/>
+            <wp:positionH relativeFrom="column">
+              <wp:posOffset>-90127</wp:posOffset>
+            </wp:positionH>
+            <wp:positionV relativeFrom="paragraph">
+              <wp:posOffset>310</wp:posOffset>
+            </wp:positionV>
+            <wp:extent cx="2931180" cy="1710000"/>
+            <wp:effectExtent l="0" t="0" r="2540" b="5080"/>
+            <wp:wrapTopAndBottom/>
+            <wp:docPr id="2001858990" name="Picture 1"/>
+            <wp:cNvGraphicFramePr>
+              <a:graphicFrameLocks xmlns:a="http://schemas.openxmlformats.org/drawingml/2006/main" noChangeAspect="1"/>
+            </wp:cNvGraphicFramePr>
+            <a:graphic xmlns:a="http://schemas.openxmlformats.org/drawingml/2006/main">
+              <a:graphicData uri="http://schemas.openxmlformats.org/drawingml/2006/picture">
+                <pic:pic xmlns:pic="http://schemas.openxmlformats.org/drawingml/2006/picture">
+                  <pic:nvPicPr>
+                    <pic:cNvPr id="2001858990" name="Picture 1"/>
+                    <pic:cNvPicPr/>
+                  </pic:nvPicPr>
+                  <pic:blipFill>
+                    <a:blip r:embed="rId13" cstate="print">
+                      <a:extLst>
+                        <a:ext uri="{28A0092B-C50C-407E-A947-70E740481C1C}">
+                          <a14:useLocalDpi xmlns:a14="http://schemas.microsoft.com/office/drawing/2010/main" val="0"/>
+                        </a:ext>
+                      </a:extLst>
+                    </a:blip>
+                    <a:stretch>
+                      <a:fillRect/>
+                    </a:stretch>
+                  </pic:blipFill>
+                  <pic:spPr>
+                    <a:xfrm>
+                      <a:off x="0" y="0"/>
+                      <a:ext cx="2931180" cy="1710000"/>
+                    </a:xfrm>
+                    <a:prstGeom prst="rect">
+                      <a:avLst/>
+                    </a:prstGeom>
+                  </pic:spPr>
+                </pic:pic>
+              </a:graphicData>
+            </a:graphic>
+            <wp14:sizeRelH relativeFrom="margin">
+              <wp14:pctWidth>0</wp14:pctWidth>
+            </wp14:sizeRelH>
+            <wp14:sizeRelV relativeFrom="margin">
+              <wp14:pctHeight>0</wp14:pctHeight>
+            </wp14:sizeRelV>
+          </wp:anchor>
+        </w:drawing>
+      </w:r>
+    </w:p>
+    <w:p>
+      <w:pPr>
+        <w:pStyle w:val="RSR"/>
+        <w:numPr>
+          <w:ilvl w:val="0"/>
+          <w:numId w:val="41"/>
+        </w:numPr>
+        <w:ind w:left="426" w:hanging="137"/>
+      </w:pPr>
+      <w:r>
+        <w:t xml:space="preserve">Bitcoin: 1.75 kg </w:t>
+      </w:r>
+      <w:proofErr w:type="spellStart"/>
+      <w:r>
+        <w:t>CO₂e</w:t>
+      </w:r>
+      <w:proofErr w:type="spellEnd"/>
+      <w:r>
+        <w:t xml:space="preserve"> (50 miners) → 37.31 kg </w:t>
+      </w:r>
+      <w:proofErr w:type="spellStart"/>
+      <w:r>
+        <w:t>CO₂e</w:t>
+      </w:r>
+      <w:proofErr w:type="spellEnd"/>
+      <w:r>
+        <w:t xml:space="preserve"> (1000 miners)</w:t>
+      </w:r>
+    </w:p>
+    <w:p>
+      <w:pPr>
+        <w:pStyle w:val="RSR"/>
+        <w:numPr>
+          <w:ilvl w:val="0"/>
+          <w:numId w:val="41"/>
+        </w:numPr>
+        <w:ind w:left="426" w:hanging="137"/>
+      </w:pPr>
+      <w:r>
+        <w:t xml:space="preserve">Ethereum: 154.28 kg </w:t>
+      </w:r>
+      <w:proofErr w:type="spellStart"/>
+      <w:r>
+        <w:t>CO₂e</w:t>
+      </w:r>
+      <w:proofErr w:type="spellEnd"/>
+      <w:r>
+        <w:t xml:space="preserve"> (50 miners) → 3085.69 kg </w:t>
+      </w:r>
+      <w:proofErr w:type="spellStart"/>
+      <w:r>
+        <w:t>CO₂e</w:t>
+      </w:r>
+      <w:proofErr w:type="spellEnd"/>
+      <w:r>
+        <w:t xml:space="preserve"> (1000 miners)</w:t>
+      </w:r>
+    </w:p>
+    <w:p>
+      <w:pPr>
+        <w:pStyle w:val="RSR"/>
+      </w:pPr>
+      <w:r>
+        <w:t xml:space="preserve">As expected, the carbon curves preserve the same ordering and near-linear scaling as energy because the model uses a constant grid factor. This follows standard emissions accounting (kWh × </w:t>
+      </w:r>
+      <w:proofErr w:type="spellStart"/>
+      <w:r>
+        <w:t>kgCO₂e</w:t>
+      </w:r>
+      <w:proofErr w:type="spellEnd"/>
+      <w:r>
+        <w:t>/kWh).</w:t>
+      </w:r>
+    </w:p>
+    <w:p>
+      <w:pPr>
+        <w:jc w:val="both"/>
+      </w:pPr>
+      <w:r>
+        <w:rPr>
+          <w:rFonts w:ascii="Times New Roman" w:hAnsi="Times New Roman"/>
+          <w:b w:val="0"/>
+          <w:i w:val="0"/>
+          <w:color w:val="C00000"/>
+          <w:sz w:val="20"/>
+        </w:rPr>
+        <w:t>Varying the grid emission factor shows that geography dominates carbon outcomes for a given energy level. For the PoW reference, daily emissions range from 23,374 t at γ = 0.05 to 383,332 t at γ = 0.82 (about a 16× spread from grid choice alone), while the PoS reference spans only 119-1947 kg. A single fixed emission factor is therefore insufficient.</w:t>
+      </w:r>
+      <w:r>
+        <w:rPr>
+          <w:rFonts w:ascii="Times New Roman" w:hAnsi="Times New Roman"/>
+          <w:color w:val="C00000"/>
+          <w:sz w:val="20"/>
+        </w:rPr>
+        <w:t xml:space="preserve"> Figure 10 reports the carbon-emission sensitivity under low, average, and high electricity emission factors γ.</w:t>
+      </w:r>
+    </w:p>
+    <w:p>
+      <w:pPr>
+        <w:jc w:val="center"/>
+      </w:pPr>
+      <w:r>
+        <w:rPr>
+          <w:rFonts w:ascii="Times New Roman" w:hAnsi="Times New Roman"/>
+          <w:color w:val="C00000"/>
+          <w:sz w:val="20"/>
+        </w:rPr>
+        <w:t>[Insert Figure 10 here: Carbon-emission sensitivity under different γ values]</w:t>
       </w:r>
     </w:p>
     <w:p>
@@ -6678,7 +7060,7 @@
           <w:rFonts w:ascii="Times New Roman" w:hAnsi="Times New Roman"/>
           <w:i/>
           <w:color w:val="C00000"/>
-          <w:sz w:val="19"/>
+          <w:sz w:val="20"/>
         </w:rPr>
         <w:t>Figure 10. Carbon emissions under low/average/high grid emission factors (log axis; 30 seeds, 95% CI).</w:t>
       </w:r>
@@ -6997,37 +7379,46 @@
       </w:r>
     </w:p>
     <w:p>
+      <w:pPr>
+        <w:jc w:val="both"/>
+      </w:pPr>
       <w:r>
         <w:rPr>
           <w:rFonts w:ascii="Times New Roman" w:hAnsi="Times New Roman"/>
           <w:b w:val="0"/>
           <w:i w:val="0"/>
           <w:color w:val="C00000"/>
-          <w:sz w:val="22"/>
+          <w:sz w:val="20"/>
         </w:rPr>
         <w:t>Additional limitations follow from the revised scope. First, the framework is a scenario-based explorer; the absolute energy and carbon values are model outputs for the chosen assumptions and are not intended to predict the exact real-world consumption of Bitcoin or Ethereum.</w:t>
       </w:r>
     </w:p>
     <w:p>
+      <w:pPr>
+        <w:jc w:val="both"/>
+      </w:pPr>
       <w:r>
         <w:rPr>
           <w:rFonts w:ascii="Times New Roman" w:hAnsi="Times New Roman"/>
           <w:b w:val="0"/>
           <w:i w:val="0"/>
           <w:color w:val="C00000"/>
-          <w:sz w:val="22"/>
+          <w:sz w:val="20"/>
         </w:rPr>
         <w:t>Second, PoW energy is sensitive to coin price, block reward, transaction fees, electricity price, mining efficiency, and difficulty/hashrate dynamics, and to the spend ratio κ; PoS energy is sensitive to validator count, node hardware, uptime, redundancy, and communication overhead.</w:t>
       </w:r>
     </w:p>
     <w:p>
+      <w:pPr>
+        <w:jc w:val="both"/>
+      </w:pPr>
       <w:r>
         <w:rPr>
           <w:rFonts w:ascii="Times New Roman" w:hAnsi="Times New Roman"/>
           <w:b w:val="0"/>
           <w:i w:val="0"/>
           <w:color w:val="C00000"/>
-          <w:sz w:val="22"/>
+          <w:sz w:val="20"/>
         </w:rPr>
         <w:t>Third, carbon depends strongly on region- and time-specific grid mixes; the γ scenarios bracket but do not resolve this variability. Finally, historical Ethereum-like PoW results must not be read as current Ethereum, which uses Proof-of-Stake, and communication energy, while small under PoW, can matter in PoS and high-throughput scenarios.</w:t>
       </w:r>
@@ -7980,6 +8371,7 @@
       <w:r>
         <w:rPr>
           <w:color w:val="C00000"/>
+          <w:sz w:val="20"/>
         </w:rPr>
         <w:t>[19] M. Platt, J. Sedlmeir, D. Platt, J. Xu, P. Tasca, N. Vadgama, and J. I. Ibanez, “The Energy Footprint of Blockchain Consensus Mechanisms Beyond Proof-of-Work,” IEEE 21st Int. Conf. on Software Quality, Reliability and Security Companion (QRS-C), 2021, pp. 1135–1144. https://doi.org/10.1109/QRS-C55045.2021.00168</w:t>
       </w:r>
@@ -7991,6 +8383,7 @@
       <w:r>
         <w:rPr>
           <w:color w:val="C00000"/>
+          <w:sz w:val="20"/>
         </w:rPr>
         <w:t>[20] M. Platt, D. Platt, and P. McBurney, “Sybil attack vulnerability trilemma,” International Journal of Parallel, Emergent and Distributed Systems, vol. 39, no. 4, pp. 446–460, 2024. https://doi.org/10.1080/17445760.2024.2352740</w:t>
       </w:r>
@@ -8002,6 +8395,7 @@
       <w:r>
         <w:rPr>
           <w:color w:val="C00000"/>
+          <w:sz w:val="20"/>
         </w:rPr>
         <w:t>[21] A. de Vries, “Cryptocurrencies on the Road to Sustainability: Ethereum Paving the Way for Bitcoin,” Patterns, vol. 4, no. 1, art. 100633, 2023. https://doi.org/10.1016/j.patter.2022.100633</w:t>
       </w:r>

</xml_diff>

<commit_message>
Color stage-6 generalization changes GREEN (keep earlier changes RED)
- generalize_crypto.py now marks the cryptocurrency-generalization edits in
  green (008000) instead of red, so the latest changes are distinguishable from
  the earlier red revision content; folded the limitations edit into the script.
- docx_to_pdf.py renders both red and green runs.
- Updated changelog and response letter notes. Audit: 22 green runs (stage 6),
  56 red runs (earlier); equations 1-11 and Figures 4-7 intact; body crypto
  mentions still just Bitcoin x1 + Ethereum x1 (background).

Co-Authored-By: Claude Opus 4.8 <noreply@anthropic.com>
Claude-Session: https://claude.ai/code/session_01G8UGacRqemk357h6YLLzRs
</commit_message>
<xml_diff>
--- a/docs/Extending_BlockSim_Energy_Carbon_REVISED_redline.docx
+++ b/docs/Extending_BlockSim_Energy_Carbon_REVISED_redline.docx
@@ -511,7 +511,7 @@
       <w:r>
         <w:rPr>
           <w:sz w:val="20"/>
-          <w:color w:val="C00000"/>
+          <w:color w:val="008000"/>
         </w:rPr>
         <w:t xml:space="preserve">representative PoW and PoS consensus scenarios</w:t>
       </w:r>
@@ -725,7 +725,7 @@
           <w:b w:val="0"/>
           <w:i w:val="0"/>
           <w:sz w:val="20"/>
-          <w:color w:val="C00000"/>
+          <w:color w:val="008000"/>
         </w:rPr>
         <w:t xml:space="preserve">Accordingly, this paper treats PoW and PoS as distinct energy regimes and presents its experiments as generic PoW and PoS consensus scenarios rather than tying them to any specific cryptocurrency.</w:t>
       </w:r>
@@ -825,7 +825,7 @@
       </w:r>
       <w:r>
         <w:rPr>
-          <w:color w:val="C00000"/>
+          <w:color w:val="008000"/>
         </w:rPr>
         <w:t xml:space="preserve">particularly permissionless PoW networks [2], [3]</w:t>
       </w:r>
@@ -894,7 +894,7 @@
           <w:b w:val="0"/>
           <w:i w:val="0"/>
           <w:sz w:val="20"/>
-          <w:color w:val="C00000"/>
+          <w:color w:val="008000"/>
         </w:rPr>
         <w:t xml:space="preserve">De Vries shows how Ethereum’s transition from PoW to PoS after The Merge illustrates why current PoS systems should not be modelled as historical PoW systems [21]</w:t>
       </w:r>
@@ -5306,7 +5306,7 @@
       </w:r>
       <w:r>
         <w:rPr>
-          <w:color w:val="C00000"/>
+          <w:color w:val="008000"/>
         </w:rPr>
         <w:t xml:space="preserve">Two PoW timing scenarios were evaluated: a long-interval PoW baseline scenario (Model 1) and a short-interval, high-throughput PoW scenario (Model 2). Block generation intervals follow the default targets of each scenario (long-interval: ~10 minutes; short-interval: ~12–13 seconds),</w:t>
       </w:r>
@@ -5344,7 +5344,7 @@
       </w:r>
       <w:r>
         <w:rPr>
-          <w:color w:val="C00000"/>
+          <w:color w:val="008000"/>
         </w:rPr>
         <w:t xml:space="preserve">the PoW baseline scenario uses a hashrate-and-efficiency-based power derivation, while the high-throughput PoW scenario uses a direct fixed per-miner power configuration</w:t>
       </w:r>
@@ -5916,7 +5916,7 @@
       </w:r>
       <w:r>
         <w:rPr>
-          <w:color w:val="C00000"/>
+          <w:color w:val="008000"/>
         </w:rPr>
         <w:t xml:space="preserve">between the two PoW scenarios in these runs</w:t>
       </w:r>
@@ -5963,7 +5963,7 @@
       <w:r/>
       <w:r>
         <w:rPr>
-          <w:color w:val="C00000"/>
+          <w:color w:val="008000"/>
         </w:rPr>
         <w:t xml:space="preserve">PoW baseline scenario: 3.93 kWh</w:t>
       </w:r>
@@ -5983,7 +5983,7 @@
       <w:r/>
       <w:r>
         <w:rPr>
-          <w:color w:val="C00000"/>
+          <w:color w:val="008000"/>
         </w:rPr>
         <w:t xml:space="preserve">High-throughput PoW scenario: 346.70 kWh</w:t>
       </w:r>
@@ -6006,7 +6006,7 @@
       </w:r>
       <w:r>
         <w:rPr>
-          <w:color w:val="C00000"/>
+          <w:color w:val="008000"/>
         </w:rPr>
         <w:t xml:space="preserve">the high-throughput-scenario totals are ~83–88× higher than the baseline-scenario totals at the same miner counts</w:t>
       </w:r>
@@ -6015,7 +6015,7 @@
       </w:r>
       <w:r>
         <w:rPr>
-          <w:color w:val="C00000"/>
+          <w:color w:val="008000"/>
         </w:rPr>
         <w:t xml:space="preserve">The primary reason is that the high-throughput scenario was configured with a fixed per-miner wattage</w:t>
       </w:r>
@@ -6024,7 +6024,7 @@
       </w:r>
       <w:r>
         <w:rPr>
-          <w:color w:val="C00000"/>
+          <w:color w:val="008000"/>
         </w:rPr>
         <w:t xml:space="preserve">whereas the baseline scenario’s effective power is substantially lower</w:t>
       </w:r>
@@ -6424,7 +6424,7 @@
       <w:r/>
       <w:r>
         <w:rPr>
-          <w:color w:val="C00000"/>
+          <w:color w:val="008000"/>
         </w:rPr>
         <w:t xml:space="preserve">Because the high-throughput PoW scenario’s modeled block interval is much shorter than the baseline scenario’s, it produces hundreds of blocks within the same simulation window while the baseline scenario produces tens of blocks. Consequently, energy per block is less extreme than total energy (since the high-throughput scenario divides its total energy across many more blocks). This effect is visible in the “step density” of event-based curves: the high-throughput scenario rises more frequently due to more block events.</w:t>
       </w:r>
@@ -6438,7 +6438,7 @@
       </w:r>
       <w:r>
         <w:rPr>
-          <w:color w:val="C00000"/>
+          <w:color w:val="008000"/>
         </w:rPr>
         <w:t xml:space="preserve">for both PoW scenarios and all miner counts. The high-throughput-scenario curves rise much more steeply</w:t>
       </w:r>
@@ -6456,7 +6456,7 @@
       <w:r/>
       <w:r>
         <w:rPr>
-          <w:color w:val="C00000"/>
+          <w:color w:val="008000"/>
         </w:rPr>
         <w:t xml:space="preserve">Each of Figures 2–3 compares the two PoW scenarios for 50 miners and 1000 miners respectively</w:t>
       </w:r>
@@ -6872,7 +6872,7 @@
       <w:r/>
       <w:r>
         <w:rPr>
-          <w:color w:val="C00000"/>
+          <w:color w:val="008000"/>
         </w:rPr>
         <w:t xml:space="preserve">PoW baseline scenario: 1.75 kg</w:t>
       </w:r>
@@ -6908,7 +6908,7 @@
       <w:r/>
       <w:r>
         <w:rPr>
-          <w:color w:val="C00000"/>
+          <w:color w:val="008000"/>
         </w:rPr>
         <w:t xml:space="preserve">High-throughput PoW scenario: 154.28 kg</w:t>
       </w:r>
@@ -7139,7 +7139,7 @@
       <w:r/>
       <w:r>
         <w:rPr>
-          <w:color w:val="C00000"/>
+          <w:color w:val="008000"/>
         </w:rPr>
         <w:t xml:space="preserve">A key observation in the comparison of the two PoW scenarios is</w:t>
       </w:r>
@@ -7148,7 +7148,7 @@
       </w:r>
       <w:r>
         <w:rPr>
-          <w:color w:val="C00000"/>
+          <w:color w:val="008000"/>
         </w:rPr>
         <w:t xml:space="preserve">In these experiments, the high-throughput PoW scenario is configured with a fixed high per-miner power</w:t>
       </w:r>
@@ -7157,7 +7157,7 @@
       </w:r>
       <w:r>
         <w:rPr>
-          <w:color w:val="C00000"/>
+          <w:color w:val="008000"/>
         </w:rPr>
         <w:t xml:space="preserve">This makes the high-throughput scenario’s cumulative energy and carbon footprint substantially larger than the baseline scenario in absolute terms, even though it also produces many more blocks</w:t>
       </w:r>
@@ -7320,7 +7320,7 @@
           <w:b w:val="0"/>
           <w:i w:val="0"/>
           <w:sz w:val="20"/>
-          <w:color w:val="C00000"/>
+          <w:color w:val="008000"/>
         </w:rPr>
         <w:t xml:space="preserve">the exact real-world consumption of any specific cryptocurrency</w:t>
       </w:r>
@@ -7370,7 +7370,7 @@
           <w:b w:val="0"/>
           <w:i w:val="0"/>
           <w:sz w:val="20"/>
-          <w:color w:val="C00000"/>
+          <w:color w:val="008000"/>
         </w:rPr>
         <w:t xml:space="preserve">Finally, the PoW results represent scenario configurations rather than any specific cryptocurrency, and communication energy</w:t>
       </w:r>

</xml_diff>